<commit_message>
Fix hero View Rulebook link
</commit_message>
<xml_diff>
--- a/public/downloads/NEXORA_2026_Rulebook.docx
+++ b/public/downloads/NEXORA_2026_Rulebook.docx
@@ -679,8 +679,6 @@
               </w:rPr>
               <w:t>IT ASSOCIATION</w:t>
             </w:r>
-            <w:bookmarkStart w:id="0" w:name="_GoBack"/>
-            <w:bookmarkEnd w:id="0"/>
           </w:p>
         </w:tc>
       </w:tr>
@@ -1273,93 +1271,118 @@
     </w:p>
     <w:p>
       <w:pPr>
-        <w:pStyle w:val="Heading1"/>
-        <w:ind w:left="-5"/>
-      </w:pPr>
-      <w:r>
-        <w:t xml:space="preserve">4. Eligibility and Team Rules </w:t>
+        <w:pStyle w:val="Heading2"/>
+        <w:rPr>
+          <w:rFonts w:ascii="Times New Roman" w:eastAsia="Times New Roman" w:hAnsi="Times New Roman" w:cs="Times New Roman"/>
+          <w:color w:val="5B9BD5" w:themeColor="accent1"/>
+          <w:sz w:val="36"/>
+        </w:rPr>
+      </w:pPr>
+      <w:r>
+        <w:rPr>
+          <w:color w:val="5B9BD5" w:themeColor="accent1"/>
+        </w:rPr>
+        <w:t>Team Participation and Authorship Guidelines</w:t>
       </w:r>
     </w:p>
     <w:p>
       <w:pPr>
         <w:numPr>
           <w:ilvl w:val="0"/>
-          <w:numId w:val="2"/>
+          <w:numId w:val="15"/>
         </w:numPr>
-        <w:ind w:hanging="360"/>
-      </w:pPr>
-      <w:r>
-        <w:t xml:space="preserve">Participation is open to eligible students as specified in the official announcement. </w:t>
+        <w:spacing w:before="100" w:beforeAutospacing="1" w:after="100" w:afterAutospacing="1" w:line="240" w:lineRule="auto"/>
+      </w:pPr>
+      <w:r>
+        <w:t xml:space="preserve">Participants may register and participate </w:t>
+      </w:r>
+      <w:r>
+        <w:rPr>
+          <w:rStyle w:val="Strong"/>
+        </w:rPr>
+        <w:t>individually or as part of a team</w:t>
+      </w:r>
+      <w:r>
+        <w:t xml:space="preserve">. </w:t>
       </w:r>
     </w:p>
     <w:p>
       <w:pPr>
         <w:numPr>
           <w:ilvl w:val="0"/>
-          <w:numId w:val="2"/>
+          <w:numId w:val="15"/>
         </w:numPr>
-        <w:ind w:hanging="360"/>
-      </w:pPr>
-      <w:r>
-        <w:t xml:space="preserve">Participants may register individually. </w:t>
+        <w:spacing w:before="100" w:beforeAutospacing="1" w:after="100" w:afterAutospacing="1" w:line="240" w:lineRule="auto"/>
+      </w:pPr>
+      <w:r>
+        <w:t xml:space="preserve">A research paper may have </w:t>
+      </w:r>
+      <w:r>
+        <w:rPr>
+          <w:rStyle w:val="Strong"/>
+        </w:rPr>
+        <w:t>multiple authors</w:t>
+      </w:r>
+      <w:r>
+        <w:t xml:space="preserve">, and all contributing members of the team must be mentioned during registration and in the submitted research paper. </w:t>
       </w:r>
     </w:p>
     <w:p>
       <w:pPr>
         <w:numPr>
           <w:ilvl w:val="0"/>
-          <w:numId w:val="2"/>
+          <w:numId w:val="15"/>
         </w:numPr>
-        <w:ind w:hanging="360"/>
-      </w:pPr>
-      <w:r>
-        <w:t xml:space="preserve">Students from different departments, years, colleges, or disciplines may collaborate if permitted. </w:t>
+        <w:spacing w:before="100" w:beforeAutospacing="1" w:after="100" w:afterAutospacing="1" w:line="240" w:lineRule="auto"/>
+      </w:pPr>
+      <w:r>
+        <w:t xml:space="preserve">In the case of team participation, </w:t>
+      </w:r>
+      <w:r>
+        <w:rPr>
+          <w:rStyle w:val="Strong"/>
+        </w:rPr>
+        <w:t>only one team member will be allowed to attend the conference and present the research paper before the evaluation panel on 14th October 2026</w:t>
+      </w:r>
+      <w:r>
+        <w:t xml:space="preserve">. </w:t>
       </w:r>
     </w:p>
     <w:p>
       <w:pPr>
         <w:numPr>
           <w:ilvl w:val="0"/>
-          <w:numId w:val="2"/>
+          <w:numId w:val="15"/>
         </w:numPr>
-        <w:ind w:hanging="360"/>
-      </w:pPr>
-      <w:r>
-        <w:t xml:space="preserve">All registration information must be accurate. </w:t>
-      </w:r>
-    </w:p>
-    <w:p>
-      <w:pPr>
-        <w:numPr>
-          <w:ilvl w:val="0"/>
-          <w:numId w:val="2"/>
-        </w:numPr>
-        <w:ind w:hanging="360"/>
-      </w:pPr>
-      <w:r>
-        <w:t xml:space="preserve">Author must be available on the conference date. </w:t>
-      </w:r>
-    </w:p>
-    <w:p>
-      <w:pPr>
-        <w:numPr>
-          <w:ilvl w:val="0"/>
-          <w:numId w:val="2"/>
-        </w:numPr>
-        <w:ind w:hanging="360"/>
-      </w:pPr>
-      <w:r>
-        <w:t xml:space="preserve">Participation is subject to registration, abstract screening, and compliance with this rule book. </w:t>
-      </w:r>
-    </w:p>
-    <w:p>
-      <w:pPr>
-        <w:spacing w:after="282" w:line="259" w:lineRule="auto"/>
-        <w:ind w:left="0" w:firstLine="0"/>
-      </w:pPr>
-      <w:r>
-        <w:t xml:space="preserve"> </w:t>
-      </w:r>
+        <w:spacing w:before="100" w:beforeAutospacing="1" w:after="100" w:afterAutospacing="1" w:line="240" w:lineRule="auto"/>
+      </w:pPr>
+      <w:r>
+        <w:t xml:space="preserve">The presenting member will be responsible for explaining the research work and responding to the </w:t>
+      </w:r>
+      <w:bookmarkStart w:id="0" w:name="_GoBack"/>
+      <w:bookmarkEnd w:id="0"/>
+      <w:r>
+        <w:t xml:space="preserve">questions asked by the evaluation panel. </w:t>
+      </w:r>
+    </w:p>
+    <w:p>
+      <w:pPr>
+        <w:pStyle w:val="NormalWeb"/>
+      </w:pPr>
+      <w:r>
+        <w:rPr>
+          <w:rStyle w:val="Strong"/>
+        </w:rPr>
+        <w:t>Note:</w:t>
+      </w:r>
+      <w:r>
+        <w:t xml:space="preserve"> All registered authors and contributing members of the team will receive participation certificates, even if only one member represents the team during the final presentation.</w:t>
+      </w:r>
+    </w:p>
+    <w:p>
+      <w:pPr>
+        <w:pStyle w:val="NormalWeb"/>
+      </w:pPr>
     </w:p>
     <w:p>
       <w:pPr>
@@ -1564,6 +1587,7 @@
         <w:rPr>
           <w:sz w:val="24"/>
         </w:rPr>
+        <w:lastRenderedPageBreak/>
         <w:t xml:space="preserve">The presentation may be followed by a question-and-answer session.  </w:t>
       </w:r>
     </w:p>
@@ -1618,7 +1642,6 @@
         <w:ind w:left="0" w:firstLine="0"/>
       </w:pPr>
       <w:r>
-        <w:lastRenderedPageBreak/>
         <w:t xml:space="preserve"> </w:t>
       </w:r>
     </w:p>
@@ -2293,6 +2316,7 @@
         <w:ind w:hanging="360"/>
       </w:pPr>
       <w:r>
+        <w:lastRenderedPageBreak/>
         <w:t xml:space="preserve">Conclusion </w:t>
       </w:r>
     </w:p>
@@ -2351,7 +2375,6 @@
         <w:ind w:hanging="360"/>
       </w:pPr>
       <w:r>
-        <w:lastRenderedPageBreak/>
         <w:t xml:space="preserve">File format: PDF  </w:t>
       </w:r>
     </w:p>
@@ -3212,6 +3235,13 @@
         <w:spacing w:after="42"/>
         <w:ind w:left="-5"/>
       </w:pPr>
+    </w:p>
+    <w:p>
+      <w:pPr>
+        <w:pStyle w:val="Heading2"/>
+        <w:spacing w:after="42"/>
+        <w:ind w:left="-5"/>
+      </w:pPr>
       <w:r>
         <w:t xml:space="preserve">9. Evaluation Criteria </w:t>
       </w:r>
@@ -3231,7 +3261,6 @@
         <w:ind w:left="-5"/>
       </w:pPr>
       <w:r>
-        <w:lastRenderedPageBreak/>
         <w:t xml:space="preserve">10. Academic Integrity and Plagiarism </w:t>
       </w:r>
     </w:p>
@@ -3541,6 +3570,7 @@
         <w:ind w:left="0" w:firstLine="0"/>
       </w:pPr>
       <w:r>
+        <w:lastRenderedPageBreak/>
         <w:t xml:space="preserve">15. Disqualification and Appeals </w:t>
       </w:r>
     </w:p>
@@ -3612,7 +3642,6 @@
         <w:jc w:val="right"/>
       </w:pPr>
       <w:r>
-        <w:lastRenderedPageBreak/>
         <w:t xml:space="preserve"> </w:t>
       </w:r>
     </w:p>
@@ -5652,6 +5681,155 @@
     </w:lvl>
   </w:abstractNum>
   <w:abstractNum w:abstractNumId="9" w15:restartNumberingAfterBreak="0">
+    <w:nsid w:val="761E3324"/>
+    <w:multiLevelType w:val="multilevel"/>
+    <w:tmpl w:val="7752EA3E"/>
+    <w:lvl w:ilvl="0">
+      <w:start w:val="1"/>
+      <w:numFmt w:val="bullet"/>
+      <w:lvlText w:val=""/>
+      <w:lvlJc w:val="left"/>
+      <w:pPr>
+        <w:tabs>
+          <w:tab w:val="num" w:pos="720"/>
+        </w:tabs>
+        <w:ind w:left="720" w:hanging="360"/>
+      </w:pPr>
+      <w:rPr>
+        <w:rFonts w:ascii="Symbol" w:hAnsi="Symbol" w:hint="default"/>
+        <w:sz w:val="20"/>
+      </w:rPr>
+    </w:lvl>
+    <w:lvl w:ilvl="1" w:tentative="1">
+      <w:start w:val="1"/>
+      <w:numFmt w:val="bullet"/>
+      <w:lvlText w:val="o"/>
+      <w:lvlJc w:val="left"/>
+      <w:pPr>
+        <w:tabs>
+          <w:tab w:val="num" w:pos="1440"/>
+        </w:tabs>
+        <w:ind w:left="1440" w:hanging="360"/>
+      </w:pPr>
+      <w:rPr>
+        <w:rFonts w:ascii="Courier New" w:hAnsi="Courier New" w:hint="default"/>
+        <w:sz w:val="20"/>
+      </w:rPr>
+    </w:lvl>
+    <w:lvl w:ilvl="2" w:tentative="1">
+      <w:start w:val="1"/>
+      <w:numFmt w:val="bullet"/>
+      <w:lvlText w:val=""/>
+      <w:lvlJc w:val="left"/>
+      <w:pPr>
+        <w:tabs>
+          <w:tab w:val="num" w:pos="2160"/>
+        </w:tabs>
+        <w:ind w:left="2160" w:hanging="360"/>
+      </w:pPr>
+      <w:rPr>
+        <w:rFonts w:ascii="Wingdings" w:hAnsi="Wingdings" w:hint="default"/>
+        <w:sz w:val="20"/>
+      </w:rPr>
+    </w:lvl>
+    <w:lvl w:ilvl="3" w:tentative="1">
+      <w:start w:val="1"/>
+      <w:numFmt w:val="bullet"/>
+      <w:lvlText w:val=""/>
+      <w:lvlJc w:val="left"/>
+      <w:pPr>
+        <w:tabs>
+          <w:tab w:val="num" w:pos="2880"/>
+        </w:tabs>
+        <w:ind w:left="2880" w:hanging="360"/>
+      </w:pPr>
+      <w:rPr>
+        <w:rFonts w:ascii="Wingdings" w:hAnsi="Wingdings" w:hint="default"/>
+        <w:sz w:val="20"/>
+      </w:rPr>
+    </w:lvl>
+    <w:lvl w:ilvl="4" w:tentative="1">
+      <w:start w:val="1"/>
+      <w:numFmt w:val="bullet"/>
+      <w:lvlText w:val=""/>
+      <w:lvlJc w:val="left"/>
+      <w:pPr>
+        <w:tabs>
+          <w:tab w:val="num" w:pos="3600"/>
+        </w:tabs>
+        <w:ind w:left="3600" w:hanging="360"/>
+      </w:pPr>
+      <w:rPr>
+        <w:rFonts w:ascii="Wingdings" w:hAnsi="Wingdings" w:hint="default"/>
+        <w:sz w:val="20"/>
+      </w:rPr>
+    </w:lvl>
+    <w:lvl w:ilvl="5" w:tentative="1">
+      <w:start w:val="1"/>
+      <w:numFmt w:val="bullet"/>
+      <w:lvlText w:val=""/>
+      <w:lvlJc w:val="left"/>
+      <w:pPr>
+        <w:tabs>
+          <w:tab w:val="num" w:pos="4320"/>
+        </w:tabs>
+        <w:ind w:left="4320" w:hanging="360"/>
+      </w:pPr>
+      <w:rPr>
+        <w:rFonts w:ascii="Wingdings" w:hAnsi="Wingdings" w:hint="default"/>
+        <w:sz w:val="20"/>
+      </w:rPr>
+    </w:lvl>
+    <w:lvl w:ilvl="6" w:tentative="1">
+      <w:start w:val="1"/>
+      <w:numFmt w:val="bullet"/>
+      <w:lvlText w:val=""/>
+      <w:lvlJc w:val="left"/>
+      <w:pPr>
+        <w:tabs>
+          <w:tab w:val="num" w:pos="5040"/>
+        </w:tabs>
+        <w:ind w:left="5040" w:hanging="360"/>
+      </w:pPr>
+      <w:rPr>
+        <w:rFonts w:ascii="Wingdings" w:hAnsi="Wingdings" w:hint="default"/>
+        <w:sz w:val="20"/>
+      </w:rPr>
+    </w:lvl>
+    <w:lvl w:ilvl="7" w:tentative="1">
+      <w:start w:val="1"/>
+      <w:numFmt w:val="bullet"/>
+      <w:lvlText w:val=""/>
+      <w:lvlJc w:val="left"/>
+      <w:pPr>
+        <w:tabs>
+          <w:tab w:val="num" w:pos="5760"/>
+        </w:tabs>
+        <w:ind w:left="5760" w:hanging="360"/>
+      </w:pPr>
+      <w:rPr>
+        <w:rFonts w:ascii="Wingdings" w:hAnsi="Wingdings" w:hint="default"/>
+        <w:sz w:val="20"/>
+      </w:rPr>
+    </w:lvl>
+    <w:lvl w:ilvl="8" w:tentative="1">
+      <w:start w:val="1"/>
+      <w:numFmt w:val="bullet"/>
+      <w:lvlText w:val=""/>
+      <w:lvlJc w:val="left"/>
+      <w:pPr>
+        <w:tabs>
+          <w:tab w:val="num" w:pos="6480"/>
+        </w:tabs>
+        <w:ind w:left="6480" w:hanging="360"/>
+      </w:pPr>
+      <w:rPr>
+        <w:rFonts w:ascii="Wingdings" w:hAnsi="Wingdings" w:hint="default"/>
+        <w:sz w:val="20"/>
+      </w:rPr>
+    </w:lvl>
+  </w:abstractNum>
+  <w:abstractNum w:abstractNumId="10" w15:restartNumberingAfterBreak="0">
     <w:nsid w:val="798839AA"/>
     <w:multiLevelType w:val="hybridMultilevel"/>
     <w:tmpl w:val="F79CDEF2"/>
@@ -5863,7 +6041,7 @@
       </w:rPr>
     </w:lvl>
   </w:abstractNum>
-  <w:abstractNum w:abstractNumId="10" w15:restartNumberingAfterBreak="0">
+  <w:abstractNum w:abstractNumId="11" w15:restartNumberingAfterBreak="0">
     <w:nsid w:val="7D0A3BA5"/>
     <w:multiLevelType w:val="hybridMultilevel"/>
     <w:tmpl w:val="E1C85400"/>
@@ -6075,7 +6253,7 @@
       </w:rPr>
     </w:lvl>
   </w:abstractNum>
-  <w:abstractNum w:abstractNumId="11" w15:restartNumberingAfterBreak="0">
+  <w:abstractNum w:abstractNumId="12" w15:restartNumberingAfterBreak="0">
     <w:nsid w:val="7DB017EB"/>
     <w:multiLevelType w:val="hybridMultilevel"/>
     <w:tmpl w:val="89727E72"/>
@@ -6287,7 +6465,7 @@
       </w:rPr>
     </w:lvl>
   </w:abstractNum>
-  <w:abstractNum w:abstractNumId="12" w15:restartNumberingAfterBreak="0">
+  <w:abstractNum w:abstractNumId="13" w15:restartNumberingAfterBreak="0">
     <w:nsid w:val="7FC17039"/>
     <w:multiLevelType w:val="hybridMultilevel"/>
     <w:tmpl w:val="143CC704"/>
@@ -6499,7 +6677,7 @@
       </w:rPr>
     </w:lvl>
   </w:abstractNum>
-  <w:abstractNum w:abstractNumId="13" w15:restartNumberingAfterBreak="0">
+  <w:abstractNum w:abstractNumId="14" w15:restartNumberingAfterBreak="0">
     <w:nsid w:val="7FC91EF0"/>
     <w:multiLevelType w:val="hybridMultilevel"/>
     <w:tmpl w:val="1F3809D6"/>
@@ -6712,19 +6890,19 @@
     </w:lvl>
   </w:abstractNum>
   <w:num w:numId="1">
+    <w:abstractNumId w:val="13"/>
+  </w:num>
+  <w:num w:numId="2">
     <w:abstractNumId w:val="12"/>
   </w:num>
-  <w:num w:numId="2">
-    <w:abstractNumId w:val="11"/>
-  </w:num>
   <w:num w:numId="3">
-    <w:abstractNumId w:val="9"/>
+    <w:abstractNumId w:val="10"/>
   </w:num>
   <w:num w:numId="4">
     <w:abstractNumId w:val="7"/>
   </w:num>
   <w:num w:numId="5">
-    <w:abstractNumId w:val="13"/>
+    <w:abstractNumId w:val="14"/>
   </w:num>
   <w:num w:numId="6">
     <w:abstractNumId w:val="1"/>
@@ -6751,7 +6929,10 @@
     <w:abstractNumId w:val="0"/>
   </w:num>
   <w:num w:numId="14">
-    <w:abstractNumId w:val="10"/>
+    <w:abstractNumId w:val="11"/>
+  </w:num>
+  <w:num w:numId="15">
+    <w:abstractNumId w:val="9"/>
   </w:num>
 </w:numbering>
 </file>
@@ -7324,6 +7505,35 @@
       <w:szCs w:val="18"/>
     </w:rPr>
   </w:style>
+  <w:style w:type="character" w:styleId="Strong">
+    <w:name w:val="Strong"/>
+    <w:basedOn w:val="DefaultParagraphFont"/>
+    <w:uiPriority w:val="22"/>
+    <w:qFormat/>
+    <w:rsid w:val="0032252C"/>
+    <w:rPr>
+      <w:b/>
+      <w:bCs/>
+    </w:rPr>
+  </w:style>
+  <w:style w:type="paragraph" w:styleId="NormalWeb">
+    <w:name w:val="Normal (Web)"/>
+    <w:basedOn w:val="Normal"/>
+    <w:uiPriority w:val="99"/>
+    <w:semiHidden/>
+    <w:unhideWhenUsed/>
+    <w:rsid w:val="0032252C"/>
+    <w:pPr>
+      <w:spacing w:before="100" w:beforeAutospacing="1" w:after="100" w:afterAutospacing="1" w:line="240" w:lineRule="auto"/>
+      <w:ind w:left="0" w:firstLine="0"/>
+    </w:pPr>
+    <w:rPr>
+      <w:rFonts w:ascii="Times New Roman" w:eastAsia="Times New Roman" w:hAnsi="Times New Roman" w:cs="Times New Roman"/>
+      <w:color w:val="auto"/>
+      <w:sz w:val="24"/>
+      <w:szCs w:val="24"/>
+    </w:rPr>
+  </w:style>
 </w:styles>
 </file>
 

</xml_diff>

<commit_message>
Replace Action column dash with done/rejected icon indicators
</commit_message>
<xml_diff>
--- a/public/downloads/NEXORA_2026_Rulebook.docx
+++ b/public/downloads/NEXORA_2026_Rulebook.docx
@@ -1292,6 +1292,9 @@
           <w:numId w:val="15"/>
         </w:numPr>
         <w:spacing w:before="100" w:beforeAutospacing="1" w:after="100" w:afterAutospacing="1" w:line="240" w:lineRule="auto"/>
+        <w:rPr>
+          <w:b/>
+        </w:rPr>
       </w:pPr>
       <w:r>
         <w:t xml:space="preserve">Participants may register and participate </w:t>
@@ -1303,7 +1306,16 @@
         <w:t>individually or as part of a team</w:t>
       </w:r>
       <w:r>
-        <w:t xml:space="preserve">. </w:t>
+        <w:rPr>
+          <w:b/>
+        </w:rPr>
+        <w:t>.</w:t>
+      </w:r>
+      <w:r>
+        <w:rPr>
+          <w:b/>
+        </w:rPr>
+        <w:t xml:space="preserve"> </w:t>
       </w:r>
     </w:p>
     <w:p>
@@ -1313,18 +1325,35 @@
           <w:numId w:val="15"/>
         </w:numPr>
         <w:spacing w:before="100" w:beforeAutospacing="1" w:after="100" w:afterAutospacing="1" w:line="240" w:lineRule="auto"/>
-      </w:pPr>
-      <w:r>
-        <w:t xml:space="preserve">A research paper may have </w:t>
-      </w:r>
-      <w:r>
         <w:rPr>
-          <w:rStyle w:val="Strong"/>
+          <w:b/>
         </w:rPr>
-        <w:t>multiple authors</w:t>
-      </w:r>
-      <w:r>
-        <w:t xml:space="preserve">, and all contributing members of the team must be mentioned during registration and in the submitted research paper. </w:t>
+      </w:pPr>
+      <w:r>
+        <w:rPr>
+          <w:b/>
+        </w:rPr>
+        <w:t>Team Formation:</w:t>
+      </w:r>
+      <w:bookmarkStart w:id="0" w:name="_GoBack"/>
+      <w:bookmarkEnd w:id="0"/>
+      <w:r>
+        <w:rPr>
+          <w:b/>
+        </w:rPr>
+        <w:t>Min 1 and Max</w:t>
+      </w:r>
+      <w:r>
+        <w:rPr>
+          <w:b/>
+        </w:rPr>
+        <w:t xml:space="preserve"> 4 in a team</w:t>
+      </w:r>
+      <w:r>
+        <w:rPr>
+          <w:b/>
+        </w:rPr>
+        <w:t>.</w:t>
       </w:r>
     </w:p>
     <w:p>
@@ -1336,16 +1365,16 @@
         <w:spacing w:before="100" w:beforeAutospacing="1" w:after="100" w:afterAutospacing="1" w:line="240" w:lineRule="auto"/>
       </w:pPr>
       <w:r>
-        <w:t xml:space="preserve">In the case of team participation, </w:t>
+        <w:t xml:space="preserve">A research paper may have </w:t>
       </w:r>
       <w:r>
         <w:rPr>
           <w:rStyle w:val="Strong"/>
         </w:rPr>
-        <w:t>only one team member will be allowed to attend the conference and present the research paper before the evaluation panel on 14th October 2026</w:t>
-      </w:r>
-      <w:r>
-        <w:t xml:space="preserve">. </w:t>
+        <w:t>multiple authors</w:t>
+      </w:r>
+      <w:r>
+        <w:t xml:space="preserve">, and all contributing members of the team must be mentioned during registration and in the submitted research paper. </w:t>
       </w:r>
     </w:p>
     <w:p>
@@ -1357,12 +1386,28 @@
         <w:spacing w:before="100" w:beforeAutospacing="1" w:after="100" w:afterAutospacing="1" w:line="240" w:lineRule="auto"/>
       </w:pPr>
       <w:r>
-        <w:t xml:space="preserve">The presenting member will be responsible for explaining the research work and responding to the </w:t>
-      </w:r>
-      <w:bookmarkStart w:id="0" w:name="_GoBack"/>
-      <w:bookmarkEnd w:id="0"/>
-      <w:r>
-        <w:t xml:space="preserve">questions asked by the evaluation panel. </w:t>
+        <w:t xml:space="preserve">In the case of team participation, </w:t>
+      </w:r>
+      <w:r>
+        <w:rPr>
+          <w:rStyle w:val="Strong"/>
+        </w:rPr>
+        <w:t>only one team member will be allowed to attend the conference and present the research paper before the evaluation panel on 14th October 2026</w:t>
+      </w:r>
+      <w:r>
+        <w:t xml:space="preserve">. </w:t>
+      </w:r>
+    </w:p>
+    <w:p>
+      <w:pPr>
+        <w:numPr>
+          <w:ilvl w:val="0"/>
+          <w:numId w:val="15"/>
+        </w:numPr>
+        <w:spacing w:before="100" w:beforeAutospacing="1" w:after="100" w:afterAutospacing="1" w:line="240" w:lineRule="auto"/>
+      </w:pPr>
+      <w:r>
+        <w:t xml:space="preserve">The presenting member will be responsible for explaining the research work and responding to the questions asked by the evaluation panel. </w:t>
       </w:r>
     </w:p>
     <w:p>
@@ -1571,6 +1616,7 @@
         <w:rPr>
           <w:sz w:val="24"/>
         </w:rPr>
+        <w:lastRenderedPageBreak/>
         <w:t xml:space="preserve">Participants will present their complete research paper before the evaluation committee.  </w:t>
       </w:r>
     </w:p>
@@ -1587,7 +1633,6 @@
         <w:rPr>
           <w:sz w:val="24"/>
         </w:rPr>
-        <w:lastRenderedPageBreak/>
         <w:t xml:space="preserve">The presentation may be followed by a question-and-answer session.  </w:t>
       </w:r>
     </w:p>
@@ -2292,6 +2337,7 @@
         <w:ind w:hanging="360"/>
       </w:pPr>
       <w:r>
+        <w:lastRenderedPageBreak/>
         <w:t xml:space="preserve">Methodology or proposed approach </w:t>
       </w:r>
     </w:p>
@@ -2316,7 +2362,6 @@
         <w:ind w:hanging="360"/>
       </w:pPr>
       <w:r>
-        <w:lastRenderedPageBreak/>
         <w:t xml:space="preserve">Conclusion </w:t>
       </w:r>
     </w:p>

</xml_diff>